<commit_message>
added managment command for tasks in bitrix and google sheets logic
</commit_message>
<xml_diff>
--- a/documents/templates_src/template_2.docx
+++ b/documents/templates_src/template_2.docx
@@ -149,27 +149,7 @@
           <w:sz w:val="20"/>
           <w:szCs w:val="20"/>
         </w:rPr>
-        <w:t>Уважаемый(</w:t>
-      </w:r>
-      <w:proofErr w:type="spellStart"/>
-      <w:r>
-        <w:rPr>
-          <w:rFonts w:ascii="Montserrat" w:eastAsia="Montserrat" w:hAnsi="Montserrat" w:cs="Montserrat"/>
-          <w:b/>
-          <w:sz w:val="20"/>
-          <w:szCs w:val="20"/>
-        </w:rPr>
-        <w:t>ая</w:t>
-      </w:r>
-      <w:proofErr w:type="spellEnd"/>
-      <w:r>
-        <w:rPr>
-          <w:rFonts w:ascii="Montserrat" w:eastAsia="Montserrat" w:hAnsi="Montserrat" w:cs="Montserrat"/>
-          <w:b/>
-          <w:sz w:val="20"/>
-          <w:szCs w:val="20"/>
-        </w:rPr>
-        <w:t xml:space="preserve">) </w:t>
+        <w:t xml:space="preserve">Уважаемый(ая) </w:t>
       </w:r>
       <w:r>
         <w:rPr>
@@ -288,7 +268,6 @@
           <w:szCs w:val="20"/>
         </w:rPr>
       </w:pPr>
-      <w:proofErr w:type="spellStart"/>
       <w:r>
         <w:rPr>
           <w:rFonts w:ascii="Montserrat" w:eastAsia="Montserrat" w:hAnsi="Montserrat" w:cs="Montserrat"/>
@@ -298,7 +277,6 @@
         </w:rPr>
         <w:t>WhatsApp</w:t>
       </w:r>
-      <w:proofErr w:type="spellEnd"/>
       <w:r>
         <w:rPr>
           <w:rFonts w:ascii="Montserrat" w:eastAsia="Montserrat" w:hAnsi="Montserrat" w:cs="Montserrat"/>
@@ -639,27 +617,7 @@
           <w:sz w:val="20"/>
           <w:szCs w:val="20"/>
         </w:rPr>
-        <w:t xml:space="preserve">. </w:t>
-      </w:r>
-      <w:proofErr w:type="spellStart"/>
-      <w:r>
-        <w:rPr>
-          <w:rFonts w:ascii="Montserrat" w:eastAsia="Montserrat" w:hAnsi="Montserrat" w:cs="Montserrat"/>
-          <w:color w:val="000000"/>
-          <w:sz w:val="20"/>
-          <w:szCs w:val="20"/>
-        </w:rPr>
-        <w:t>Ростов</w:t>
-      </w:r>
-      <w:proofErr w:type="spellEnd"/>
-      <w:r>
-        <w:rPr>
-          <w:rFonts w:ascii="Montserrat" w:eastAsia="Montserrat" w:hAnsi="Montserrat" w:cs="Montserrat"/>
-          <w:color w:val="000000"/>
-          <w:sz w:val="20"/>
-          <w:szCs w:val="20"/>
-        </w:rPr>
-        <w:t>-на-Дону</w:t>
+        <w:t>. Ростов-на-Дону</w:t>
       </w:r>
       <w:r>
         <w:rPr>
@@ -3352,27 +3310,7 @@
           <w:sz w:val="20"/>
           <w:szCs w:val="20"/>
         </w:rPr>
-        <w:t xml:space="preserve">В случае разногласий Стороны будут разрешать спор в досудебном порядке. В случае </w:t>
-      </w:r>
-      <w:proofErr w:type="spellStart"/>
-      <w:r>
-        <w:rPr>
-          <w:rFonts w:ascii="Montserrat" w:eastAsia="Montserrat" w:hAnsi="Montserrat" w:cs="Montserrat"/>
-          <w:color w:val="000000"/>
-          <w:sz w:val="20"/>
-          <w:szCs w:val="20"/>
-        </w:rPr>
-        <w:t>неразрешения</w:t>
-      </w:r>
-      <w:proofErr w:type="spellEnd"/>
-      <w:r>
-        <w:rPr>
-          <w:rFonts w:ascii="Montserrat" w:eastAsia="Montserrat" w:hAnsi="Montserrat" w:cs="Montserrat"/>
-          <w:color w:val="000000"/>
-          <w:sz w:val="20"/>
-          <w:szCs w:val="20"/>
-        </w:rPr>
-        <w:t xml:space="preserve"> спора в досудебном порядке разногласия разрешаются Сторонами в судебном порядке.</w:t>
+        <w:t>В случае разногласий Стороны будут разрешать спор в досудебном порядке. В случае неразрешения спора в досудебном порядке разногласия разрешаются Сторонами в судебном порядке.</w:t>
       </w:r>
     </w:p>
     <w:p>
@@ -4288,27 +4226,7 @@
                 <w:sz w:val="20"/>
                 <w:szCs w:val="20"/>
               </w:rPr>
-              <w:t xml:space="preserve">проспект 40-летия Победы, д. 63/17, корп./ст. 3, кв./оф. 328, Ростовская область, г. </w:t>
-            </w:r>
-            <w:proofErr w:type="spellStart"/>
-            <w:r>
-              <w:rPr>
-                <w:rFonts w:ascii="Montserrat" w:eastAsia="Montserrat" w:hAnsi="Montserrat" w:cs="Montserrat"/>
-                <w:color w:val="000000"/>
-                <w:sz w:val="20"/>
-                <w:szCs w:val="20"/>
-              </w:rPr>
-              <w:t>Ростов</w:t>
-            </w:r>
-            <w:proofErr w:type="spellEnd"/>
-            <w:r>
-              <w:rPr>
-                <w:rFonts w:ascii="Montserrat" w:eastAsia="Montserrat" w:hAnsi="Montserrat" w:cs="Montserrat"/>
-                <w:color w:val="000000"/>
-                <w:sz w:val="20"/>
-                <w:szCs w:val="20"/>
-              </w:rPr>
-              <w:t>-на-Дону</w:t>
+              <w:t>проспект 40-летия Победы, д. 63/17, корп./ст. 3, кв./оф. 328, Ростовская область, г. Ростов-на-Дону</w:t>
             </w:r>
           </w:p>
           <w:p>
@@ -10930,7 +10848,61 @@
                 <w:sz w:val="20"/>
                 <w:szCs w:val="20"/>
               </w:rPr>
-              <w:t>105-18-68</w:t>
+              <w:t>1</w:t>
+            </w:r>
+            <w:r>
+              <w:rPr>
+                <w:rFonts w:ascii="Montserrat" w:eastAsia="Montserrat" w:hAnsi="Montserrat" w:cs="Montserrat"/>
+                <w:color w:val="000000"/>
+                <w:sz w:val="20"/>
+                <w:szCs w:val="20"/>
+              </w:rPr>
+              <w:t>20</w:t>
+            </w:r>
+            <w:r>
+              <w:rPr>
+                <w:rFonts w:ascii="Montserrat" w:eastAsia="Montserrat" w:hAnsi="Montserrat" w:cs="Montserrat"/>
+                <w:color w:val="000000"/>
+                <w:sz w:val="20"/>
+                <w:szCs w:val="20"/>
+              </w:rPr>
+              <w:t>-</w:t>
+            </w:r>
+            <w:r>
+              <w:rPr>
+                <w:rFonts w:ascii="Montserrat" w:eastAsia="Montserrat" w:hAnsi="Montserrat" w:cs="Montserrat"/>
+                <w:color w:val="000000"/>
+                <w:sz w:val="20"/>
+                <w:szCs w:val="20"/>
+              </w:rPr>
+              <w:t>31</w:t>
+            </w:r>
+            <w:r>
+              <w:rPr>
+                <w:rFonts w:ascii="Montserrat" w:eastAsia="Montserrat" w:hAnsi="Montserrat" w:cs="Montserrat"/>
+                <w:color w:val="000000"/>
+                <w:sz w:val="20"/>
+                <w:szCs w:val="20"/>
+              </w:rPr>
+              <w:t>-</w:t>
+            </w:r>
+            <w:r>
+              <w:rPr>
+                <w:rFonts w:ascii="Montserrat" w:eastAsia="Montserrat" w:hAnsi="Montserrat" w:cs="Montserrat"/>
+                <w:color w:val="000000"/>
+                <w:sz w:val="20"/>
+                <w:szCs w:val="20"/>
+              </w:rPr>
+              <w:t>9</w:t>
+            </w:r>
+            <w:r>
+              <w:rPr>
+                <w:rFonts w:ascii="Montserrat" w:eastAsia="Montserrat" w:hAnsi="Montserrat" w:cs="Montserrat"/>
+                <w:color w:val="000000"/>
+                <w:sz w:val="20"/>
+                <w:szCs w:val="20"/>
+              </w:rPr>
+              <w:t>8</w:t>
             </w:r>
           </w:p>
         </w:tc>
@@ -12013,115 +11985,7 @@
           <w:sz w:val="20"/>
           <w:szCs w:val="20"/>
         </w:rPr>
-        <w:t xml:space="preserve"> (далее по тексту — Сайт), включая все его </w:t>
-      </w:r>
-      <w:proofErr w:type="spellStart"/>
-      <w:r>
-        <w:rPr>
-          <w:rFonts w:ascii="Montserrat" w:eastAsia="Montserrat" w:hAnsi="Montserrat" w:cs="Montserrat"/>
-          <w:sz w:val="20"/>
-          <w:szCs w:val="20"/>
-        </w:rPr>
-        <w:t>поддомены</w:t>
-      </w:r>
-      <w:proofErr w:type="spellEnd"/>
-      <w:r>
-        <w:rPr>
-          <w:rFonts w:ascii="Montserrat" w:eastAsia="Montserrat" w:hAnsi="Montserrat" w:cs="Montserrat"/>
-          <w:sz w:val="20"/>
-          <w:szCs w:val="20"/>
-        </w:rPr>
-        <w:t xml:space="preserve">, в социальных сетях ИСПОЛНИТЕЛЯ, в т.ч. в Telegram, </w:t>
-      </w:r>
-      <w:proofErr w:type="spellStart"/>
-      <w:r>
-        <w:rPr>
-          <w:rFonts w:ascii="Montserrat" w:eastAsia="Montserrat" w:hAnsi="Montserrat" w:cs="Montserrat"/>
-          <w:sz w:val="20"/>
-          <w:szCs w:val="20"/>
-        </w:rPr>
-        <w:t>Вконтакте</w:t>
-      </w:r>
-      <w:proofErr w:type="spellEnd"/>
-      <w:r>
-        <w:rPr>
-          <w:rFonts w:ascii="Montserrat" w:eastAsia="Montserrat" w:hAnsi="Montserrat" w:cs="Montserrat"/>
-          <w:sz w:val="20"/>
-          <w:szCs w:val="20"/>
-        </w:rPr>
-        <w:t xml:space="preserve">, </w:t>
-      </w:r>
-      <w:proofErr w:type="spellStart"/>
-      <w:r>
-        <w:rPr>
-          <w:rFonts w:ascii="Montserrat" w:eastAsia="Montserrat" w:hAnsi="Montserrat" w:cs="Montserrat"/>
-          <w:sz w:val="20"/>
-          <w:szCs w:val="20"/>
-        </w:rPr>
-        <w:t>WhatsApp</w:t>
-      </w:r>
-      <w:proofErr w:type="spellEnd"/>
-      <w:r>
-        <w:rPr>
-          <w:rFonts w:ascii="Montserrat" w:eastAsia="Montserrat" w:hAnsi="Montserrat" w:cs="Montserrat"/>
-          <w:sz w:val="20"/>
-          <w:szCs w:val="20"/>
-        </w:rPr>
-        <w:t xml:space="preserve">, Одноклассники, Дзен, </w:t>
-      </w:r>
-      <w:proofErr w:type="spellStart"/>
-      <w:r>
-        <w:rPr>
-          <w:rFonts w:ascii="Montserrat" w:eastAsia="Montserrat" w:hAnsi="Montserrat" w:cs="Montserrat"/>
-          <w:sz w:val="20"/>
-          <w:szCs w:val="20"/>
-        </w:rPr>
-        <w:t>RuTube</w:t>
-      </w:r>
-      <w:proofErr w:type="spellEnd"/>
-      <w:r>
-        <w:rPr>
-          <w:rFonts w:ascii="Montserrat" w:eastAsia="Montserrat" w:hAnsi="Montserrat" w:cs="Montserrat"/>
-          <w:sz w:val="20"/>
-          <w:szCs w:val="20"/>
-        </w:rPr>
-        <w:t xml:space="preserve">, YouTube, </w:t>
-      </w:r>
-      <w:proofErr w:type="spellStart"/>
-      <w:r>
-        <w:rPr>
-          <w:rFonts w:ascii="Montserrat" w:eastAsia="Montserrat" w:hAnsi="Montserrat" w:cs="Montserrat"/>
-          <w:sz w:val="20"/>
-          <w:szCs w:val="20"/>
-        </w:rPr>
-        <w:t>TikTok</w:t>
-      </w:r>
-      <w:proofErr w:type="spellEnd"/>
-      <w:r>
-        <w:rPr>
-          <w:rFonts w:ascii="Montserrat" w:eastAsia="Montserrat" w:hAnsi="Montserrat" w:cs="Montserrat"/>
-          <w:sz w:val="20"/>
-          <w:szCs w:val="20"/>
-        </w:rPr>
-        <w:t xml:space="preserve">, </w:t>
-      </w:r>
-      <w:proofErr w:type="spellStart"/>
-      <w:r>
-        <w:rPr>
-          <w:rFonts w:ascii="Montserrat" w:eastAsia="Montserrat" w:hAnsi="Montserrat" w:cs="Montserrat"/>
-          <w:sz w:val="20"/>
-          <w:szCs w:val="20"/>
-        </w:rPr>
-        <w:t>Instagram</w:t>
-      </w:r>
-      <w:proofErr w:type="spellEnd"/>
-      <w:r>
-        <w:rPr>
-          <w:rFonts w:ascii="Montserrat" w:eastAsia="Montserrat" w:hAnsi="Montserrat" w:cs="Montserrat"/>
-          <w:sz w:val="20"/>
-          <w:szCs w:val="20"/>
-        </w:rPr>
-        <w:t xml:space="preserve"> (запрещённая на территории Российской Федерация социальная сеть) (далее по тексту — Согласие). </w:t>
+        <w:t xml:space="preserve"> (далее по тексту — Сайт), включая все его поддомены, в социальных сетях ИСПОЛНИТЕЛЯ, в т.ч. в Telegram, Вконтакте, WhatsApp, Одноклассники, Дзен, RuTube, YouTube, TikTok, Instagram (запрещённая на территории Российской Федерация социальная сеть) (далее по тексту — Согласие). </w:t>
       </w:r>
     </w:p>
     <w:p>
@@ -12466,23 +12330,7 @@
           <w:rFonts w:ascii="Montserrat" w:eastAsia="Montserrat" w:hAnsi="Montserrat" w:cs="Montserrat"/>
           <w:b/>
         </w:rPr>
-        <w:t>«</w:t>
-      </w:r>
-      <w:proofErr w:type="spellStart"/>
-      <w:r>
-        <w:rPr>
-          <w:rFonts w:ascii="Montserrat" w:eastAsia="Montserrat" w:hAnsi="Montserrat" w:cs="Montserrat"/>
-          <w:b/>
-        </w:rPr>
-        <w:t>Правбюро</w:t>
-      </w:r>
-      <w:proofErr w:type="spellEnd"/>
-      <w:r>
-        <w:rPr>
-          <w:rFonts w:ascii="Montserrat" w:eastAsia="Montserrat" w:hAnsi="Montserrat" w:cs="Montserrat"/>
-          <w:b/>
-        </w:rPr>
-        <w:t>»</w:t>
+        <w:t>«Правбюро»</w:t>
       </w:r>
       <w:r>
         <w:rPr>
@@ -12585,21 +12433,7 @@
         <w:rPr>
           <w:rFonts w:ascii="Montserrat" w:eastAsia="Montserrat" w:hAnsi="Montserrat" w:cs="Montserrat"/>
         </w:rPr>
-        <w:t xml:space="preserve">Или напрямую в </w:t>
-      </w:r>
-      <w:proofErr w:type="spellStart"/>
-      <w:r>
-        <w:rPr>
-          <w:rFonts w:ascii="Montserrat" w:eastAsia="Montserrat" w:hAnsi="Montserrat" w:cs="Montserrat"/>
-        </w:rPr>
-        <w:t>WhatsApp</w:t>
-      </w:r>
-      <w:proofErr w:type="spellEnd"/>
-      <w:r>
-        <w:rPr>
-          <w:rFonts w:ascii="Montserrat" w:eastAsia="Montserrat" w:hAnsi="Montserrat" w:cs="Montserrat"/>
-        </w:rPr>
-        <w:t xml:space="preserve"> нашему руководителю, </w:t>
+        <w:t xml:space="preserve">Или напрямую в WhatsApp нашему руководителю, </w:t>
       </w:r>
       <w:r>
         <w:rPr>

</xml_diff>

<commit_message>
Restore Table Grid style in contract template
</commit_message>
<xml_diff>
--- a/documents/templates_src/template_2.docx
+++ b/documents/templates_src/template_2.docx
@@ -7627,6 +7627,218 @@
     </w:sectPr>
   </w:body>
 </w:document>
+</file>
+
+<file path=word/styles.xml><?xml version="1.0" encoding="utf-8"?>
+<w:styles xmlns:mc="http://schemas.openxmlformats.org/markup-compatibility/2006" xmlns:r="http://schemas.openxmlformats.org/officeDocument/2006/relationships" xmlns:w14="http://schemas.microsoft.com/office/word/2010/wordml" xmlns:w="http://schemas.openxmlformats.org/wordprocessingml/2006/main" mc:Ignorable="w14">
+  <w:docDefaults>
+    <w:rPrDefault>
+      <w:rPr>
+        <w:rFonts w:asciiTheme="minorHAnsi" w:eastAsiaTheme="minorEastAsia" w:hAnsiTheme="minorHAnsi" w:cstheme="minorBidi"/>
+        <w:sz w:val="24"/>
+        <w:szCs w:val="24"/>
+        <w:lang w:val="en-US" w:eastAsia="en-US" w:bidi="ar-SA"/>
+      </w:rPr>
+    </w:rPrDefault>
+    <w:pPrDefault/>
+  </w:docDefaults>
+  <w:latentStyles w:defLockedState="0" w:defUIPriority="99" w:defSemiHidden="1" w:defUnhideWhenUsed="1" w:defQFormat="0" w:count="276">
+    <w:lsdException w:name="Normal" w:semiHidden="0" w:uiPriority="0" w:unhideWhenUsed="0" w:qFormat="1"/>
+    <w:lsdException w:name="heading 1" w:semiHidden="0" w:uiPriority="9" w:unhideWhenUsed="0" w:qFormat="1"/>
+    <w:lsdException w:name="heading 2" w:uiPriority="9" w:qFormat="1"/>
+    <w:lsdException w:name="heading 3" w:uiPriority="9" w:qFormat="1"/>
+    <w:lsdException w:name="heading 4" w:uiPriority="9" w:qFormat="1"/>
+    <w:lsdException w:name="heading 5" w:uiPriority="9" w:qFormat="1"/>
+    <w:lsdException w:name="heading 6" w:uiPriority="9" w:qFormat="1"/>
+    <w:lsdException w:name="heading 7" w:uiPriority="9" w:qFormat="1"/>
+    <w:lsdException w:name="heading 8" w:uiPriority="9" w:qFormat="1"/>
+    <w:lsdException w:name="heading 9" w:uiPriority="9" w:qFormat="1"/>
+    <w:lsdException w:name="toc 1" w:uiPriority="39"/>
+    <w:lsdException w:name="toc 2" w:uiPriority="39"/>
+    <w:lsdException w:name="toc 3" w:uiPriority="39"/>
+    <w:lsdException w:name="toc 4" w:uiPriority="39"/>
+    <w:lsdException w:name="toc 5" w:uiPriority="39"/>
+    <w:lsdException w:name="toc 6" w:uiPriority="39"/>
+    <w:lsdException w:name="toc 7" w:uiPriority="39"/>
+    <w:lsdException w:name="toc 8" w:uiPriority="39"/>
+    <w:lsdException w:name="toc 9" w:uiPriority="39"/>
+    <w:lsdException w:name="caption" w:uiPriority="35" w:qFormat="1"/>
+    <w:lsdException w:name="Title" w:semiHidden="0" w:uiPriority="10" w:unhideWhenUsed="0" w:qFormat="1"/>
+    <w:lsdException w:name="Default Paragraph Font" w:uiPriority="1"/>
+    <w:lsdException w:name="Subtitle" w:semiHidden="0" w:uiPriority="11" w:unhideWhenUsed="0" w:qFormat="1"/>
+    <w:lsdException w:name="Strong" w:semiHidden="0" w:uiPriority="22" w:unhideWhenUsed="0" w:qFormat="1"/>
+    <w:lsdException w:name="Emphasis" w:semiHidden="0" w:uiPriority="20" w:unhideWhenUsed="0" w:qFormat="1"/>
+    <w:lsdException w:name="Table Grid" w:semiHidden="0" w:uiPriority="59" w:unhideWhenUsed="0"/>
+    <w:lsdException w:name="Placeholder Text" w:unhideWhenUsed="0"/>
+    <w:lsdException w:name="No Spacing" w:semiHidden="0" w:uiPriority="1" w:unhideWhenUsed="0" w:qFormat="1"/>
+    <w:lsdException w:name="Light Shading" w:semiHidden="0" w:uiPriority="60" w:unhideWhenUsed="0"/>
+    <w:lsdException w:name="Light List" w:semiHidden="0" w:uiPriority="61" w:unhideWhenUsed="0"/>
+    <w:lsdException w:name="Light Grid" w:semiHidden="0" w:uiPriority="62" w:unhideWhenUsed="0"/>
+    <w:lsdException w:name="Medium Shading 1" w:semiHidden="0" w:uiPriority="63" w:unhideWhenUsed="0"/>
+    <w:lsdException w:name="Medium Shading 2" w:semiHidden="0" w:uiPriority="64" w:unhideWhenUsed="0"/>
+    <w:lsdException w:name="Medium List 1" w:semiHidden="0" w:uiPriority="65" w:unhideWhenUsed="0"/>
+    <w:lsdException w:name="Medium List 2" w:semiHidden="0" w:uiPriority="66" w:unhideWhenUsed="0"/>
+    <w:lsdException w:name="Medium Grid 1" w:semiHidden="0" w:uiPriority="67" w:unhideWhenUsed="0"/>
+    <w:lsdException w:name="Medium Grid 2" w:semiHidden="0" w:uiPriority="68" w:unhideWhenUsed="0"/>
+    <w:lsdException w:name="Medium Grid 3" w:semiHidden="0" w:uiPriority="69" w:unhideWhenUsed="0"/>
+    <w:lsdException w:name="Dark List" w:semiHidden="0" w:uiPriority="70" w:unhideWhenUsed="0"/>
+    <w:lsdException w:name="Colorful Shading" w:semiHidden="0" w:uiPriority="71" w:unhideWhenUsed="0"/>
+    <w:lsdException w:name="Colorful List" w:semiHidden="0" w:uiPriority="72" w:unhideWhenUsed="0"/>
+    <w:lsdException w:name="Colorful Grid" w:semiHidden="0" w:uiPriority="73" w:unhideWhenUsed="0"/>
+    <w:lsdException w:name="Light Shading Accent 1" w:semiHidden="0" w:uiPriority="60" w:unhideWhenUsed="0"/>
+    <w:lsdException w:name="Light List Accent 1" w:semiHidden="0" w:uiPriority="61" w:unhideWhenUsed="0"/>
+    <w:lsdException w:name="Light Grid Accent 1" w:semiHidden="0" w:uiPriority="62" w:unhideWhenUsed="0"/>
+    <w:lsdException w:name="Medium Shading 1 Accent 1" w:semiHidden="0" w:uiPriority="63" w:unhideWhenUsed="0"/>
+    <w:lsdException w:name="Medium Shading 2 Accent 1" w:semiHidden="0" w:uiPriority="64" w:unhideWhenUsed="0"/>
+    <w:lsdException w:name="Medium List 1 Accent 1" w:semiHidden="0" w:uiPriority="65" w:unhideWhenUsed="0"/>
+    <w:lsdException w:name="Revision" w:unhideWhenUsed="0"/>
+    <w:lsdException w:name="List Paragraph" w:semiHidden="0" w:uiPriority="34" w:unhideWhenUsed="0" w:qFormat="1"/>
+    <w:lsdException w:name="Quote" w:semiHidden="0" w:uiPriority="29" w:unhideWhenUsed="0" w:qFormat="1"/>
+    <w:lsdException w:name="Intense Quote" w:semiHidden="0" w:uiPriority="30" w:unhideWhenUsed="0" w:qFormat="1"/>
+    <w:lsdException w:name="Medium List 2 Accent 1" w:semiHidden="0" w:uiPriority="66" w:unhideWhenUsed="0"/>
+    <w:lsdException w:name="Medium Grid 1 Accent 1" w:semiHidden="0" w:uiPriority="67" w:unhideWhenUsed="0"/>
+    <w:lsdException w:name="Medium Grid 2 Accent 1" w:semiHidden="0" w:uiPriority="68" w:unhideWhenUsed="0"/>
+    <w:lsdException w:name="Medium Grid 3 Accent 1" w:semiHidden="0" w:uiPriority="69" w:unhideWhenUsed="0"/>
+    <w:lsdException w:name="Dark List Accent 1" w:semiHidden="0" w:uiPriority="70" w:unhideWhenUsed="0"/>
+    <w:lsdException w:name="Colorful Shading Accent 1" w:semiHidden="0" w:uiPriority="71" w:unhideWhenUsed="0"/>
+    <w:lsdException w:name="Colorful List Accent 1" w:semiHidden="0" w:uiPriority="72" w:unhideWhenUsed="0"/>
+    <w:lsdException w:name="Colorful Grid Accent 1" w:semiHidden="0" w:uiPriority="73" w:unhideWhenUsed="0"/>
+    <w:lsdException w:name="Light Shading Accent 2" w:semiHidden="0" w:uiPriority="60" w:unhideWhenUsed="0"/>
+    <w:lsdException w:name="Light List Accent 2" w:semiHidden="0" w:uiPriority="61" w:unhideWhenUsed="0"/>
+    <w:lsdException w:name="Light Grid Accent 2" w:semiHidden="0" w:uiPriority="62" w:unhideWhenUsed="0"/>
+    <w:lsdException w:name="Medium Shading 1 Accent 2" w:semiHidden="0" w:uiPriority="63" w:unhideWhenUsed="0"/>
+    <w:lsdException w:name="Medium Shading 2 Accent 2" w:semiHidden="0" w:uiPriority="64" w:unhideWhenUsed="0"/>
+    <w:lsdException w:name="Medium List 1 Accent 2" w:semiHidden="0" w:uiPriority="65" w:unhideWhenUsed="0"/>
+    <w:lsdException w:name="Medium List 2 Accent 2" w:semiHidden="0" w:uiPriority="66" w:unhideWhenUsed="0"/>
+    <w:lsdException w:name="Medium Grid 1 Accent 2" w:semiHidden="0" w:uiPriority="67" w:unhideWhenUsed="0"/>
+    <w:lsdException w:name="Medium Grid 2 Accent 2" w:semiHidden="0" w:uiPriority="68" w:unhideWhenUsed="0"/>
+    <w:lsdException w:name="Medium Grid 3 Accent 2" w:semiHidden="0" w:uiPriority="69" w:unhideWhenUsed="0"/>
+    <w:lsdException w:name="Dark List Accent 2" w:semiHidden="0" w:uiPriority="70" w:unhideWhenUsed="0"/>
+    <w:lsdException w:name="Colorful Shading Accent 2" w:semiHidden="0" w:uiPriority="71" w:unhideWhenUsed="0"/>
+    <w:lsdException w:name="Colorful List Accent 2" w:semiHidden="0" w:uiPriority="72" w:unhideWhenUsed="0"/>
+    <w:lsdException w:name="Colorful Grid Accent 2" w:semiHidden="0" w:uiPriority="73" w:unhideWhenUsed="0"/>
+    <w:lsdException w:name="Light Shading Accent 3" w:semiHidden="0" w:uiPriority="60" w:unhideWhenUsed="0"/>
+    <w:lsdException w:name="Light List Accent 3" w:semiHidden="0" w:uiPriority="61" w:unhideWhenUsed="0"/>
+    <w:lsdException w:name="Light Grid Accent 3" w:semiHidden="0" w:uiPriority="62" w:unhideWhenUsed="0"/>
+    <w:lsdException w:name="Medium Shading 1 Accent 3" w:semiHidden="0" w:uiPriority="63" w:unhideWhenUsed="0"/>
+    <w:lsdException w:name="Medium Shading 2 Accent 3" w:semiHidden="0" w:uiPriority="64" w:unhideWhenUsed="0"/>
+    <w:lsdException w:name="Medium List 1 Accent 3" w:semiHidden="0" w:uiPriority="65" w:unhideWhenUsed="0"/>
+    <w:lsdException w:name="Medium List 2 Accent 3" w:semiHidden="0" w:uiPriority="66" w:unhideWhenUsed="0"/>
+    <w:lsdException w:name="Medium Grid 1 Accent 3" w:semiHidden="0" w:uiPriority="67" w:unhideWhenUsed="0"/>
+    <w:lsdException w:name="Medium Grid 2 Accent 3" w:semiHidden="0" w:uiPriority="68" w:unhideWhenUsed="0"/>
+    <w:lsdException w:name="Medium Grid 3 Accent 3" w:semiHidden="0" w:uiPriority="69" w:unhideWhenUsed="0"/>
+    <w:lsdException w:name="Dark List Accent 3" w:semiHidden="0" w:uiPriority="70" w:unhideWhenUsed="0"/>
+    <w:lsdException w:name="Colorful Shading Accent 3" w:semiHidden="0" w:uiPriority="71" w:unhideWhenUsed="0"/>
+    <w:lsdException w:name="Colorful List Accent 3" w:semiHidden="0" w:uiPriority="72" w:unhideWhenUsed="0"/>
+    <w:lsdException w:name="Colorful Grid Accent 3" w:semiHidden="0" w:uiPriority="73" w:unhideWhenUsed="0"/>
+    <w:lsdException w:name="Light Shading Accent 4" w:semiHidden="0" w:uiPriority="60" w:unhideWhenUsed="0"/>
+    <w:lsdException w:name="Light List Accent 4" w:semiHidden="0" w:uiPriority="61" w:unhideWhenUsed="0"/>
+    <w:lsdException w:name="Light Grid Accent 4" w:semiHidden="0" w:uiPriority="62" w:unhideWhenUsed="0"/>
+    <w:lsdException w:name="Medium Shading 1 Accent 4" w:semiHidden="0" w:uiPriority="63" w:unhideWhenUsed="0"/>
+    <w:lsdException w:name="Medium Shading 2 Accent 4" w:semiHidden="0" w:uiPriority="64" w:unhideWhenUsed="0"/>
+    <w:lsdException w:name="Medium List 1 Accent 4" w:semiHidden="0" w:uiPriority="65" w:unhideWhenUsed="0"/>
+    <w:lsdException w:name="Medium List 2 Accent 4" w:semiHidden="0" w:uiPriority="66" w:unhideWhenUsed="0"/>
+    <w:lsdException w:name="Medium Grid 1 Accent 4" w:semiHidden="0" w:uiPriority="67" w:unhideWhenUsed="0"/>
+    <w:lsdException w:name="Medium Grid 2 Accent 4" w:semiHidden="0" w:uiPriority="68" w:unhideWhenUsed="0"/>
+    <w:lsdException w:name="Medium Grid 3 Accent 4" w:semiHidden="0" w:uiPriority="69" w:unhideWhenUsed="0"/>
+    <w:lsdException w:name="Dark List Accent 4" w:semiHidden="0" w:uiPriority="70" w:unhideWhenUsed="0"/>
+    <w:lsdException w:name="Colorful Shading Accent 4" w:semiHidden="0" w:uiPriority="71" w:unhideWhenUsed="0"/>
+    <w:lsdException w:name="Colorful List Accent 4" w:semiHidden="0" w:uiPriority="72" w:unhideWhenUsed="0"/>
+    <w:lsdException w:name="Colorful Grid Accent 4" w:semiHidden="0" w:uiPriority="73" w:unhideWhenUsed="0"/>
+    <w:lsdException w:name="Light Shading Accent 5" w:semiHidden="0" w:uiPriority="60" w:unhideWhenUsed="0"/>
+    <w:lsdException w:name="Light List Accent 5" w:semiHidden="0" w:uiPriority="61" w:unhideWhenUsed="0"/>
+    <w:lsdException w:name="Light Grid Accent 5" w:semiHidden="0" w:uiPriority="62" w:unhideWhenUsed="0"/>
+    <w:lsdException w:name="Medium Shading 1 Accent 5" w:semiHidden="0" w:uiPriority="63" w:unhideWhenUsed="0"/>
+    <w:lsdException w:name="Medium Shading 2 Accent 5" w:semiHidden="0" w:uiPriority="64" w:unhideWhenUsed="0"/>
+    <w:lsdException w:name="Medium List 1 Accent 5" w:semiHidden="0" w:uiPriority="65" w:unhideWhenUsed="0"/>
+    <w:lsdException w:name="Medium List 2 Accent 5" w:semiHidden="0" w:uiPriority="66" w:unhideWhenUsed="0"/>
+    <w:lsdException w:name="Medium Grid 1 Accent 5" w:semiHidden="0" w:uiPriority="67" w:unhideWhenUsed="0"/>
+    <w:lsdException w:name="Medium Grid 2 Accent 5" w:semiHidden="0" w:uiPriority="68" w:unhideWhenUsed="0"/>
+    <w:lsdException w:name="Medium Grid 3 Accent 5" w:semiHidden="0" w:uiPriority="69" w:unhideWhenUsed="0"/>
+    <w:lsdException w:name="Dark List Accent 5" w:semiHidden="0" w:uiPriority="70" w:unhideWhenUsed="0"/>
+    <w:lsdException w:name="Colorful Shading Accent 5" w:semiHidden="0" w:uiPriority="71" w:unhideWhenUsed="0"/>
+    <w:lsdException w:name="Colorful List Accent 5" w:semiHidden="0" w:uiPriority="72" w:unhideWhenUsed="0"/>
+    <w:lsdException w:name="Colorful Grid Accent 5" w:semiHidden="0" w:uiPriority="73" w:unhideWhenUsed="0"/>
+    <w:lsdException w:name="Light Shading Accent 6" w:semiHidden="0" w:uiPriority="60" w:unhideWhenUsed="0"/>
+    <w:lsdException w:name="Light List Accent 6" w:semiHidden="0" w:uiPriority="61" w:unhideWhenUsed="0"/>
+    <w:lsdException w:name="Light Grid Accent 6" w:semiHidden="0" w:uiPriority="62" w:unhideWhenUsed="0"/>
+    <w:lsdException w:name="Medium Shading 1 Accent 6" w:semiHidden="0" w:uiPriority="63" w:unhideWhenUsed="0"/>
+    <w:lsdException w:name="Medium Shading 2 Accent 6" w:semiHidden="0" w:uiPriority="64" w:unhideWhenUsed="0"/>
+    <w:lsdException w:name="Medium List 1 Accent 6" w:semiHidden="0" w:uiPriority="65" w:unhideWhenUsed="0"/>
+    <w:lsdException w:name="Medium List 2 Accent 6" w:semiHidden="0" w:uiPriority="66" w:unhideWhenUsed="0"/>
+    <w:lsdException w:name="Medium Grid 1 Accent 6" w:semiHidden="0" w:uiPriority="67" w:unhideWhenUsed="0"/>
+    <w:lsdException w:name="Medium Grid 2 Accent 6" w:semiHidden="0" w:uiPriority="68" w:unhideWhenUsed="0"/>
+    <w:lsdException w:name="Medium Grid 3 Accent 6" w:semiHidden="0" w:uiPriority="69" w:unhideWhenUsed="0"/>
+    <w:lsdException w:name="Dark List Accent 6" w:semiHidden="0" w:uiPriority="70" w:unhideWhenUsed="0"/>
+    <w:lsdException w:name="Colorful Shading Accent 6" w:semiHidden="0" w:uiPriority="71" w:unhideWhenUsed="0"/>
+    <w:lsdException w:name="Colorful List Accent 6" w:semiHidden="0" w:uiPriority="72" w:unhideWhenUsed="0"/>
+    <w:lsdException w:name="Colorful Grid Accent 6" w:semiHidden="0" w:uiPriority="73" w:unhideWhenUsed="0"/>
+    <w:lsdException w:name="Subtle Emphasis" w:semiHidden="0" w:uiPriority="19" w:unhideWhenUsed="0" w:qFormat="1"/>
+    <w:lsdException w:name="Intense Emphasis" w:semiHidden="0" w:uiPriority="21" w:unhideWhenUsed="0" w:qFormat="1"/>
+    <w:lsdException w:name="Subtle Reference" w:semiHidden="0" w:uiPriority="31" w:unhideWhenUsed="0" w:qFormat="1"/>
+    <w:lsdException w:name="Intense Reference" w:semiHidden="0" w:uiPriority="32" w:unhideWhenUsed="0" w:qFormat="1"/>
+    <w:lsdException w:name="Book Title" w:semiHidden="0" w:uiPriority="33" w:unhideWhenUsed="0" w:qFormat="1"/>
+    <w:lsdException w:name="Bibliography" w:uiPriority="37"/>
+    <w:lsdException w:name="TOC Heading" w:uiPriority="39" w:qFormat="1"/>
+  </w:latentStyles>
+  <w:style w:type="paragraph" w:default="1" w:styleId="Normal">
+    <w:name w:val="Normal"/>
+    <w:qFormat/>
+  </w:style>
+  <w:style w:type="character" w:default="1" w:styleId="DefaultParagraphFont">
+    <w:name w:val="Default Paragraph Font"/>
+    <w:uiPriority w:val="1"/>
+    <w:semiHidden/>
+    <w:unhideWhenUsed/>
+  </w:style>
+  <w:style w:type="table" w:default="1" w:styleId="TableNormal">
+    <w:name w:val="Normal Table"/>
+    <w:uiPriority w:val="99"/>
+    <w:semiHidden/>
+    <w:unhideWhenUsed/>
+    <w:tblPr>
+      <w:tblInd w:w="0" w:type="dxa"/>
+      <w:tblCellMar>
+        <w:top w:w="0" w:type="dxa"/>
+        <w:left w:w="108" w:type="dxa"/>
+        <w:bottom w:w="0" w:type="dxa"/>
+        <w:right w:w="108" w:type="dxa"/>
+      </w:tblCellMar>
+    </w:tblPr>
+  </w:style>
+  <w:style w:type="numbering" w:default="1" w:styleId="NoList">
+    <w:name w:val="No List"/>
+    <w:uiPriority w:val="99"/>
+    <w:semiHidden/>
+    <w:unhideWhenUsed/>
+  </w:style>
+  <w:style w:type="table" w:styleId="TableGrid">
+    <w:name w:val="Table Grid"/>
+    <w:basedOn w:val="TableNormal"/>
+    <w:uiPriority w:val="59"/>
+    <w:rsid w:val="00FC693F"/>
+    <w:pPr>
+      <w:spacing w:after="0" w:line="240" w:lineRule="auto"/>
+    </w:pPr>
+    <w:tblPr>
+      <w:tblInd w:w="0" w:type="dxa"/>
+      <w:tblBorders>
+        <w:top w:val="single" w:sz="4" w:space="0" w:color="auto"/>
+        <w:left w:val="single" w:sz="4" w:space="0" w:color="auto"/>
+        <w:bottom w:val="single" w:sz="4" w:space="0" w:color="auto"/>
+        <w:right w:val="single" w:sz="4" w:space="0" w:color="auto"/>
+        <w:insideH w:val="single" w:sz="4" w:space="0" w:color="auto"/>
+        <w:insideV w:val="single" w:sz="4" w:space="0" w:color="auto"/>
+      </w:tblBorders>
+      <w:tblCellMar>
+        <w:top w:w="0" w:type="dxa"/>
+        <w:left w:w="108" w:type="dxa"/>
+        <w:bottom w:w="0" w:type="dxa"/>
+        <w:right w:w="108" w:type="dxa"/>
+      </w:tblCellMar>
+    </w:tblPr>
+  </w:style>
+</w:styles>
 </file>
 
 <file path=word/theme/theme1.xml><?xml version="1.0" encoding="utf-8"?>

</xml_diff>

<commit_message>
Revert "Restore Table Grid style in contract template"
This reverts commit 515c582e7b6a75c07fdb40a756471920490784ac.
</commit_message>
<xml_diff>
--- a/documents/templates_src/template_2.docx
+++ b/documents/templates_src/template_2.docx
@@ -7627,218 +7627,6 @@
     </w:sectPr>
   </w:body>
 </w:document>
-</file>
-
-<file path=word/styles.xml><?xml version="1.0" encoding="utf-8"?>
-<w:styles xmlns:mc="http://schemas.openxmlformats.org/markup-compatibility/2006" xmlns:r="http://schemas.openxmlformats.org/officeDocument/2006/relationships" xmlns:w14="http://schemas.microsoft.com/office/word/2010/wordml" xmlns:w="http://schemas.openxmlformats.org/wordprocessingml/2006/main" mc:Ignorable="w14">
-  <w:docDefaults>
-    <w:rPrDefault>
-      <w:rPr>
-        <w:rFonts w:asciiTheme="minorHAnsi" w:eastAsiaTheme="minorEastAsia" w:hAnsiTheme="minorHAnsi" w:cstheme="minorBidi"/>
-        <w:sz w:val="24"/>
-        <w:szCs w:val="24"/>
-        <w:lang w:val="en-US" w:eastAsia="en-US" w:bidi="ar-SA"/>
-      </w:rPr>
-    </w:rPrDefault>
-    <w:pPrDefault/>
-  </w:docDefaults>
-  <w:latentStyles w:defLockedState="0" w:defUIPriority="99" w:defSemiHidden="1" w:defUnhideWhenUsed="1" w:defQFormat="0" w:count="276">
-    <w:lsdException w:name="Normal" w:semiHidden="0" w:uiPriority="0" w:unhideWhenUsed="0" w:qFormat="1"/>
-    <w:lsdException w:name="heading 1" w:semiHidden="0" w:uiPriority="9" w:unhideWhenUsed="0" w:qFormat="1"/>
-    <w:lsdException w:name="heading 2" w:uiPriority="9" w:qFormat="1"/>
-    <w:lsdException w:name="heading 3" w:uiPriority="9" w:qFormat="1"/>
-    <w:lsdException w:name="heading 4" w:uiPriority="9" w:qFormat="1"/>
-    <w:lsdException w:name="heading 5" w:uiPriority="9" w:qFormat="1"/>
-    <w:lsdException w:name="heading 6" w:uiPriority="9" w:qFormat="1"/>
-    <w:lsdException w:name="heading 7" w:uiPriority="9" w:qFormat="1"/>
-    <w:lsdException w:name="heading 8" w:uiPriority="9" w:qFormat="1"/>
-    <w:lsdException w:name="heading 9" w:uiPriority="9" w:qFormat="1"/>
-    <w:lsdException w:name="toc 1" w:uiPriority="39"/>
-    <w:lsdException w:name="toc 2" w:uiPriority="39"/>
-    <w:lsdException w:name="toc 3" w:uiPriority="39"/>
-    <w:lsdException w:name="toc 4" w:uiPriority="39"/>
-    <w:lsdException w:name="toc 5" w:uiPriority="39"/>
-    <w:lsdException w:name="toc 6" w:uiPriority="39"/>
-    <w:lsdException w:name="toc 7" w:uiPriority="39"/>
-    <w:lsdException w:name="toc 8" w:uiPriority="39"/>
-    <w:lsdException w:name="toc 9" w:uiPriority="39"/>
-    <w:lsdException w:name="caption" w:uiPriority="35" w:qFormat="1"/>
-    <w:lsdException w:name="Title" w:semiHidden="0" w:uiPriority="10" w:unhideWhenUsed="0" w:qFormat="1"/>
-    <w:lsdException w:name="Default Paragraph Font" w:uiPriority="1"/>
-    <w:lsdException w:name="Subtitle" w:semiHidden="0" w:uiPriority="11" w:unhideWhenUsed="0" w:qFormat="1"/>
-    <w:lsdException w:name="Strong" w:semiHidden="0" w:uiPriority="22" w:unhideWhenUsed="0" w:qFormat="1"/>
-    <w:lsdException w:name="Emphasis" w:semiHidden="0" w:uiPriority="20" w:unhideWhenUsed="0" w:qFormat="1"/>
-    <w:lsdException w:name="Table Grid" w:semiHidden="0" w:uiPriority="59" w:unhideWhenUsed="0"/>
-    <w:lsdException w:name="Placeholder Text" w:unhideWhenUsed="0"/>
-    <w:lsdException w:name="No Spacing" w:semiHidden="0" w:uiPriority="1" w:unhideWhenUsed="0" w:qFormat="1"/>
-    <w:lsdException w:name="Light Shading" w:semiHidden="0" w:uiPriority="60" w:unhideWhenUsed="0"/>
-    <w:lsdException w:name="Light List" w:semiHidden="0" w:uiPriority="61" w:unhideWhenUsed="0"/>
-    <w:lsdException w:name="Light Grid" w:semiHidden="0" w:uiPriority="62" w:unhideWhenUsed="0"/>
-    <w:lsdException w:name="Medium Shading 1" w:semiHidden="0" w:uiPriority="63" w:unhideWhenUsed="0"/>
-    <w:lsdException w:name="Medium Shading 2" w:semiHidden="0" w:uiPriority="64" w:unhideWhenUsed="0"/>
-    <w:lsdException w:name="Medium List 1" w:semiHidden="0" w:uiPriority="65" w:unhideWhenUsed="0"/>
-    <w:lsdException w:name="Medium List 2" w:semiHidden="0" w:uiPriority="66" w:unhideWhenUsed="0"/>
-    <w:lsdException w:name="Medium Grid 1" w:semiHidden="0" w:uiPriority="67" w:unhideWhenUsed="0"/>
-    <w:lsdException w:name="Medium Grid 2" w:semiHidden="0" w:uiPriority="68" w:unhideWhenUsed="0"/>
-    <w:lsdException w:name="Medium Grid 3" w:semiHidden="0" w:uiPriority="69" w:unhideWhenUsed="0"/>
-    <w:lsdException w:name="Dark List" w:semiHidden="0" w:uiPriority="70" w:unhideWhenUsed="0"/>
-    <w:lsdException w:name="Colorful Shading" w:semiHidden="0" w:uiPriority="71" w:unhideWhenUsed="0"/>
-    <w:lsdException w:name="Colorful List" w:semiHidden="0" w:uiPriority="72" w:unhideWhenUsed="0"/>
-    <w:lsdException w:name="Colorful Grid" w:semiHidden="0" w:uiPriority="73" w:unhideWhenUsed="0"/>
-    <w:lsdException w:name="Light Shading Accent 1" w:semiHidden="0" w:uiPriority="60" w:unhideWhenUsed="0"/>
-    <w:lsdException w:name="Light List Accent 1" w:semiHidden="0" w:uiPriority="61" w:unhideWhenUsed="0"/>
-    <w:lsdException w:name="Light Grid Accent 1" w:semiHidden="0" w:uiPriority="62" w:unhideWhenUsed="0"/>
-    <w:lsdException w:name="Medium Shading 1 Accent 1" w:semiHidden="0" w:uiPriority="63" w:unhideWhenUsed="0"/>
-    <w:lsdException w:name="Medium Shading 2 Accent 1" w:semiHidden="0" w:uiPriority="64" w:unhideWhenUsed="0"/>
-    <w:lsdException w:name="Medium List 1 Accent 1" w:semiHidden="0" w:uiPriority="65" w:unhideWhenUsed="0"/>
-    <w:lsdException w:name="Revision" w:unhideWhenUsed="0"/>
-    <w:lsdException w:name="List Paragraph" w:semiHidden="0" w:uiPriority="34" w:unhideWhenUsed="0" w:qFormat="1"/>
-    <w:lsdException w:name="Quote" w:semiHidden="0" w:uiPriority="29" w:unhideWhenUsed="0" w:qFormat="1"/>
-    <w:lsdException w:name="Intense Quote" w:semiHidden="0" w:uiPriority="30" w:unhideWhenUsed="0" w:qFormat="1"/>
-    <w:lsdException w:name="Medium List 2 Accent 1" w:semiHidden="0" w:uiPriority="66" w:unhideWhenUsed="0"/>
-    <w:lsdException w:name="Medium Grid 1 Accent 1" w:semiHidden="0" w:uiPriority="67" w:unhideWhenUsed="0"/>
-    <w:lsdException w:name="Medium Grid 2 Accent 1" w:semiHidden="0" w:uiPriority="68" w:unhideWhenUsed="0"/>
-    <w:lsdException w:name="Medium Grid 3 Accent 1" w:semiHidden="0" w:uiPriority="69" w:unhideWhenUsed="0"/>
-    <w:lsdException w:name="Dark List Accent 1" w:semiHidden="0" w:uiPriority="70" w:unhideWhenUsed="0"/>
-    <w:lsdException w:name="Colorful Shading Accent 1" w:semiHidden="0" w:uiPriority="71" w:unhideWhenUsed="0"/>
-    <w:lsdException w:name="Colorful List Accent 1" w:semiHidden="0" w:uiPriority="72" w:unhideWhenUsed="0"/>
-    <w:lsdException w:name="Colorful Grid Accent 1" w:semiHidden="0" w:uiPriority="73" w:unhideWhenUsed="0"/>
-    <w:lsdException w:name="Light Shading Accent 2" w:semiHidden="0" w:uiPriority="60" w:unhideWhenUsed="0"/>
-    <w:lsdException w:name="Light List Accent 2" w:semiHidden="0" w:uiPriority="61" w:unhideWhenUsed="0"/>
-    <w:lsdException w:name="Light Grid Accent 2" w:semiHidden="0" w:uiPriority="62" w:unhideWhenUsed="0"/>
-    <w:lsdException w:name="Medium Shading 1 Accent 2" w:semiHidden="0" w:uiPriority="63" w:unhideWhenUsed="0"/>
-    <w:lsdException w:name="Medium Shading 2 Accent 2" w:semiHidden="0" w:uiPriority="64" w:unhideWhenUsed="0"/>
-    <w:lsdException w:name="Medium List 1 Accent 2" w:semiHidden="0" w:uiPriority="65" w:unhideWhenUsed="0"/>
-    <w:lsdException w:name="Medium List 2 Accent 2" w:semiHidden="0" w:uiPriority="66" w:unhideWhenUsed="0"/>
-    <w:lsdException w:name="Medium Grid 1 Accent 2" w:semiHidden="0" w:uiPriority="67" w:unhideWhenUsed="0"/>
-    <w:lsdException w:name="Medium Grid 2 Accent 2" w:semiHidden="0" w:uiPriority="68" w:unhideWhenUsed="0"/>
-    <w:lsdException w:name="Medium Grid 3 Accent 2" w:semiHidden="0" w:uiPriority="69" w:unhideWhenUsed="0"/>
-    <w:lsdException w:name="Dark List Accent 2" w:semiHidden="0" w:uiPriority="70" w:unhideWhenUsed="0"/>
-    <w:lsdException w:name="Colorful Shading Accent 2" w:semiHidden="0" w:uiPriority="71" w:unhideWhenUsed="0"/>
-    <w:lsdException w:name="Colorful List Accent 2" w:semiHidden="0" w:uiPriority="72" w:unhideWhenUsed="0"/>
-    <w:lsdException w:name="Colorful Grid Accent 2" w:semiHidden="0" w:uiPriority="73" w:unhideWhenUsed="0"/>
-    <w:lsdException w:name="Light Shading Accent 3" w:semiHidden="0" w:uiPriority="60" w:unhideWhenUsed="0"/>
-    <w:lsdException w:name="Light List Accent 3" w:semiHidden="0" w:uiPriority="61" w:unhideWhenUsed="0"/>
-    <w:lsdException w:name="Light Grid Accent 3" w:semiHidden="0" w:uiPriority="62" w:unhideWhenUsed="0"/>
-    <w:lsdException w:name="Medium Shading 1 Accent 3" w:semiHidden="0" w:uiPriority="63" w:unhideWhenUsed="0"/>
-    <w:lsdException w:name="Medium Shading 2 Accent 3" w:semiHidden="0" w:uiPriority="64" w:unhideWhenUsed="0"/>
-    <w:lsdException w:name="Medium List 1 Accent 3" w:semiHidden="0" w:uiPriority="65" w:unhideWhenUsed="0"/>
-    <w:lsdException w:name="Medium List 2 Accent 3" w:semiHidden="0" w:uiPriority="66" w:unhideWhenUsed="0"/>
-    <w:lsdException w:name="Medium Grid 1 Accent 3" w:semiHidden="0" w:uiPriority="67" w:unhideWhenUsed="0"/>
-    <w:lsdException w:name="Medium Grid 2 Accent 3" w:semiHidden="0" w:uiPriority="68" w:unhideWhenUsed="0"/>
-    <w:lsdException w:name="Medium Grid 3 Accent 3" w:semiHidden="0" w:uiPriority="69" w:unhideWhenUsed="0"/>
-    <w:lsdException w:name="Dark List Accent 3" w:semiHidden="0" w:uiPriority="70" w:unhideWhenUsed="0"/>
-    <w:lsdException w:name="Colorful Shading Accent 3" w:semiHidden="0" w:uiPriority="71" w:unhideWhenUsed="0"/>
-    <w:lsdException w:name="Colorful List Accent 3" w:semiHidden="0" w:uiPriority="72" w:unhideWhenUsed="0"/>
-    <w:lsdException w:name="Colorful Grid Accent 3" w:semiHidden="0" w:uiPriority="73" w:unhideWhenUsed="0"/>
-    <w:lsdException w:name="Light Shading Accent 4" w:semiHidden="0" w:uiPriority="60" w:unhideWhenUsed="0"/>
-    <w:lsdException w:name="Light List Accent 4" w:semiHidden="0" w:uiPriority="61" w:unhideWhenUsed="0"/>
-    <w:lsdException w:name="Light Grid Accent 4" w:semiHidden="0" w:uiPriority="62" w:unhideWhenUsed="0"/>
-    <w:lsdException w:name="Medium Shading 1 Accent 4" w:semiHidden="0" w:uiPriority="63" w:unhideWhenUsed="0"/>
-    <w:lsdException w:name="Medium Shading 2 Accent 4" w:semiHidden="0" w:uiPriority="64" w:unhideWhenUsed="0"/>
-    <w:lsdException w:name="Medium List 1 Accent 4" w:semiHidden="0" w:uiPriority="65" w:unhideWhenUsed="0"/>
-    <w:lsdException w:name="Medium List 2 Accent 4" w:semiHidden="0" w:uiPriority="66" w:unhideWhenUsed="0"/>
-    <w:lsdException w:name="Medium Grid 1 Accent 4" w:semiHidden="0" w:uiPriority="67" w:unhideWhenUsed="0"/>
-    <w:lsdException w:name="Medium Grid 2 Accent 4" w:semiHidden="0" w:uiPriority="68" w:unhideWhenUsed="0"/>
-    <w:lsdException w:name="Medium Grid 3 Accent 4" w:semiHidden="0" w:uiPriority="69" w:unhideWhenUsed="0"/>
-    <w:lsdException w:name="Dark List Accent 4" w:semiHidden="0" w:uiPriority="70" w:unhideWhenUsed="0"/>
-    <w:lsdException w:name="Colorful Shading Accent 4" w:semiHidden="0" w:uiPriority="71" w:unhideWhenUsed="0"/>
-    <w:lsdException w:name="Colorful List Accent 4" w:semiHidden="0" w:uiPriority="72" w:unhideWhenUsed="0"/>
-    <w:lsdException w:name="Colorful Grid Accent 4" w:semiHidden="0" w:uiPriority="73" w:unhideWhenUsed="0"/>
-    <w:lsdException w:name="Light Shading Accent 5" w:semiHidden="0" w:uiPriority="60" w:unhideWhenUsed="0"/>
-    <w:lsdException w:name="Light List Accent 5" w:semiHidden="0" w:uiPriority="61" w:unhideWhenUsed="0"/>
-    <w:lsdException w:name="Light Grid Accent 5" w:semiHidden="0" w:uiPriority="62" w:unhideWhenUsed="0"/>
-    <w:lsdException w:name="Medium Shading 1 Accent 5" w:semiHidden="0" w:uiPriority="63" w:unhideWhenUsed="0"/>
-    <w:lsdException w:name="Medium Shading 2 Accent 5" w:semiHidden="0" w:uiPriority="64" w:unhideWhenUsed="0"/>
-    <w:lsdException w:name="Medium List 1 Accent 5" w:semiHidden="0" w:uiPriority="65" w:unhideWhenUsed="0"/>
-    <w:lsdException w:name="Medium List 2 Accent 5" w:semiHidden="0" w:uiPriority="66" w:unhideWhenUsed="0"/>
-    <w:lsdException w:name="Medium Grid 1 Accent 5" w:semiHidden="0" w:uiPriority="67" w:unhideWhenUsed="0"/>
-    <w:lsdException w:name="Medium Grid 2 Accent 5" w:semiHidden="0" w:uiPriority="68" w:unhideWhenUsed="0"/>
-    <w:lsdException w:name="Medium Grid 3 Accent 5" w:semiHidden="0" w:uiPriority="69" w:unhideWhenUsed="0"/>
-    <w:lsdException w:name="Dark List Accent 5" w:semiHidden="0" w:uiPriority="70" w:unhideWhenUsed="0"/>
-    <w:lsdException w:name="Colorful Shading Accent 5" w:semiHidden="0" w:uiPriority="71" w:unhideWhenUsed="0"/>
-    <w:lsdException w:name="Colorful List Accent 5" w:semiHidden="0" w:uiPriority="72" w:unhideWhenUsed="0"/>
-    <w:lsdException w:name="Colorful Grid Accent 5" w:semiHidden="0" w:uiPriority="73" w:unhideWhenUsed="0"/>
-    <w:lsdException w:name="Light Shading Accent 6" w:semiHidden="0" w:uiPriority="60" w:unhideWhenUsed="0"/>
-    <w:lsdException w:name="Light List Accent 6" w:semiHidden="0" w:uiPriority="61" w:unhideWhenUsed="0"/>
-    <w:lsdException w:name="Light Grid Accent 6" w:semiHidden="0" w:uiPriority="62" w:unhideWhenUsed="0"/>
-    <w:lsdException w:name="Medium Shading 1 Accent 6" w:semiHidden="0" w:uiPriority="63" w:unhideWhenUsed="0"/>
-    <w:lsdException w:name="Medium Shading 2 Accent 6" w:semiHidden="0" w:uiPriority="64" w:unhideWhenUsed="0"/>
-    <w:lsdException w:name="Medium List 1 Accent 6" w:semiHidden="0" w:uiPriority="65" w:unhideWhenUsed="0"/>
-    <w:lsdException w:name="Medium List 2 Accent 6" w:semiHidden="0" w:uiPriority="66" w:unhideWhenUsed="0"/>
-    <w:lsdException w:name="Medium Grid 1 Accent 6" w:semiHidden="0" w:uiPriority="67" w:unhideWhenUsed="0"/>
-    <w:lsdException w:name="Medium Grid 2 Accent 6" w:semiHidden="0" w:uiPriority="68" w:unhideWhenUsed="0"/>
-    <w:lsdException w:name="Medium Grid 3 Accent 6" w:semiHidden="0" w:uiPriority="69" w:unhideWhenUsed="0"/>
-    <w:lsdException w:name="Dark List Accent 6" w:semiHidden="0" w:uiPriority="70" w:unhideWhenUsed="0"/>
-    <w:lsdException w:name="Colorful Shading Accent 6" w:semiHidden="0" w:uiPriority="71" w:unhideWhenUsed="0"/>
-    <w:lsdException w:name="Colorful List Accent 6" w:semiHidden="0" w:uiPriority="72" w:unhideWhenUsed="0"/>
-    <w:lsdException w:name="Colorful Grid Accent 6" w:semiHidden="0" w:uiPriority="73" w:unhideWhenUsed="0"/>
-    <w:lsdException w:name="Subtle Emphasis" w:semiHidden="0" w:uiPriority="19" w:unhideWhenUsed="0" w:qFormat="1"/>
-    <w:lsdException w:name="Intense Emphasis" w:semiHidden="0" w:uiPriority="21" w:unhideWhenUsed="0" w:qFormat="1"/>
-    <w:lsdException w:name="Subtle Reference" w:semiHidden="0" w:uiPriority="31" w:unhideWhenUsed="0" w:qFormat="1"/>
-    <w:lsdException w:name="Intense Reference" w:semiHidden="0" w:uiPriority="32" w:unhideWhenUsed="0" w:qFormat="1"/>
-    <w:lsdException w:name="Book Title" w:semiHidden="0" w:uiPriority="33" w:unhideWhenUsed="0" w:qFormat="1"/>
-    <w:lsdException w:name="Bibliography" w:uiPriority="37"/>
-    <w:lsdException w:name="TOC Heading" w:uiPriority="39" w:qFormat="1"/>
-  </w:latentStyles>
-  <w:style w:type="paragraph" w:default="1" w:styleId="Normal">
-    <w:name w:val="Normal"/>
-    <w:qFormat/>
-  </w:style>
-  <w:style w:type="character" w:default="1" w:styleId="DefaultParagraphFont">
-    <w:name w:val="Default Paragraph Font"/>
-    <w:uiPriority w:val="1"/>
-    <w:semiHidden/>
-    <w:unhideWhenUsed/>
-  </w:style>
-  <w:style w:type="table" w:default="1" w:styleId="TableNormal">
-    <w:name w:val="Normal Table"/>
-    <w:uiPriority w:val="99"/>
-    <w:semiHidden/>
-    <w:unhideWhenUsed/>
-    <w:tblPr>
-      <w:tblInd w:w="0" w:type="dxa"/>
-      <w:tblCellMar>
-        <w:top w:w="0" w:type="dxa"/>
-        <w:left w:w="108" w:type="dxa"/>
-        <w:bottom w:w="0" w:type="dxa"/>
-        <w:right w:w="108" w:type="dxa"/>
-      </w:tblCellMar>
-    </w:tblPr>
-  </w:style>
-  <w:style w:type="numbering" w:default="1" w:styleId="NoList">
-    <w:name w:val="No List"/>
-    <w:uiPriority w:val="99"/>
-    <w:semiHidden/>
-    <w:unhideWhenUsed/>
-  </w:style>
-  <w:style w:type="table" w:styleId="TableGrid">
-    <w:name w:val="Table Grid"/>
-    <w:basedOn w:val="TableNormal"/>
-    <w:uiPriority w:val="59"/>
-    <w:rsid w:val="00FC693F"/>
-    <w:pPr>
-      <w:spacing w:after="0" w:line="240" w:lineRule="auto"/>
-    </w:pPr>
-    <w:tblPr>
-      <w:tblInd w:w="0" w:type="dxa"/>
-      <w:tblBorders>
-        <w:top w:val="single" w:sz="4" w:space="0" w:color="auto"/>
-        <w:left w:val="single" w:sz="4" w:space="0" w:color="auto"/>
-        <w:bottom w:val="single" w:sz="4" w:space="0" w:color="auto"/>
-        <w:right w:val="single" w:sz="4" w:space="0" w:color="auto"/>
-        <w:insideH w:val="single" w:sz="4" w:space="0" w:color="auto"/>
-        <w:insideV w:val="single" w:sz="4" w:space="0" w:color="auto"/>
-      </w:tblBorders>
-      <w:tblCellMar>
-        <w:top w:w="0" w:type="dxa"/>
-        <w:left w:w="108" w:type="dxa"/>
-        <w:bottom w:w="0" w:type="dxa"/>
-        <w:right w:w="108" w:type="dxa"/>
-      </w:tblCellMar>
-    </w:tblPr>
-  </w:style>
-</w:styles>
 </file>
 
 <file path=word/theme/theme1.xml><?xml version="1.0" encoding="utf-8"?>

</xml_diff>

<commit_message>
Update contract termination and payment terms
</commit_message>
<xml_diff>
--- a/documents/templates_src/template_2.docx
+++ b/documents/templates_src/template_2.docx
@@ -2461,6 +2461,41 @@
     </w:p>
     <w:p>
       <w:pPr>
+        <w:numPr>
+          <w:ilvl w:val="1"/>
+          <w:numId w:val="3"/>
+        </w:numPr>
+        <w:pBdr>
+          <w:top w:val="nil"/>
+          <w:left w:val="nil"/>
+          <w:bottom w:val="nil"/>
+          <w:right w:val="nil"/>
+          <w:between w:val="nil"/>
+        </w:pBdr>
+        <w:tabs>
+          <w:tab w:val="left" w:pos="872"/>
+          <w:tab w:val="left" w:pos="1276"/>
+        </w:tabs>
+        <w:spacing w:line="249" w:lineRule="auto"/>
+        <w:ind w:right="256" w:hanging="2"/>
+        <w:jc w:val="both"/>
+        <w:rPr>
+          <w:rFonts w:ascii="Montserrat" w:eastAsia="Montserrat" w:hAnsi="Montserrat" w:cs="Montserrat"/>
+          <w:color w:val="000000"/>
+        </w:rPr>
+      </w:pPr>
+      <w:r>
+        <w:rPr>
+          <w:rFonts w:ascii="Montserrat" w:eastAsia="Montserrat" w:hAnsi="Montserrat" w:cs="Montserrat"/>
+          <w:color w:val="000000"/>
+          <w:sz w:val="20"/>
+          <w:szCs w:val="20"/>
+        </w:rPr>
+        <w:t>В течение всего действия настоящего договора ЗАКАЗЧИК вправе воспользоваться отсрочкой платежей, предусматривающей смещение сроков оплаты каждого из оставшихся платежей в соответствии с графиком (Приложение 4) на срок от 1 (одного) до 30 (тридцати) календарных дней, путем направления соответствующего обращения ИСПОЛНИТЕЛЮ. Суммарная длительность отсрочки платежей в течение действия настоящего договора не может превышать 30 (тридцать) календарных дней. Общий размер вознаграждения ИСПОЛНИТЕЛЯ, указанный в п. 3.1. настоящего Договора остается неизменным.</w:t>
+      </w:r>
+    </w:p>
+    <w:p>
+      <w:pPr>
         <w:rPr>
           <w:rFonts w:ascii="Montserrat" w:eastAsia="Montserrat" w:hAnsi="Montserrat" w:cs="Montserrat"/>
           <w:sz w:val="20"/>
@@ -2938,7 +2973,7 @@
           <w:sz w:val="20"/>
           <w:szCs w:val="20"/>
         </w:rPr>
-        <w:t>— Если в ходе оказания услуг по настоящему Договору ИСПОЛНИТЕЛЬ придёт к выводу о невозможности решения правовыми средствами вопроса, указанного в п. 1.2 настоящего Договора, в связи с умышленным сокрытием ЗАКАЗЧИКОМ юридически значимых фактов, негативно влияющих на перспективу инициирования, а равно —завершения дела о банкротстве.</w:t>
+        <w:t>— Неисполнения ЗАКАЗЧИКОМ условий, предусмотренных п. 3.2. настоящего Договора, в том числе невнесения ЗАКАЗЧИКОМ платежей суммарно (сумма просрочек уплаты внесенных и очередного платежей) в течение 30 (тридцати) календарных дней с даты, указанной в графике (Приложение 4), с учетом положений п. 3.4. настоящего договора о праве ЗАКАЗЧИКА на отсрочку платежей.</w:t>
       </w:r>
     </w:p>
     <w:p>
@@ -2971,40 +3006,7 @@
           <w:sz w:val="20"/>
           <w:szCs w:val="20"/>
         </w:rPr>
-        <w:t>— Неисполнения ЗАКАЗЧИКОМ условий, предусмотренных п. 3.2. настоящего Договора, в том числе невнесения ЗАКАЗЧИКОМ очередного платежа в течение 30 (тридцати) дней с даты, указанной в Графике.</w:t>
-      </w:r>
-    </w:p>
-    <w:p>
-      <w:pPr>
-        <w:pBdr>
-          <w:top w:val="nil"/>
-          <w:left w:val="nil"/>
-          <w:bottom w:val="nil"/>
-          <w:right w:val="nil"/>
-          <w:between w:val="nil"/>
-        </w:pBdr>
-        <w:tabs>
-          <w:tab w:val="left" w:pos="872"/>
-          <w:tab w:val="left" w:pos="1239"/>
-        </w:tabs>
-        <w:spacing w:before="2" w:line="242" w:lineRule="auto"/>
-        <w:ind w:left="872" w:right="258"/>
-        <w:jc w:val="both"/>
-        <w:rPr>
-          <w:rFonts w:ascii="Montserrat" w:eastAsia="Montserrat" w:hAnsi="Montserrat" w:cs="Montserrat"/>
-          <w:color w:val="000000"/>
-          <w:sz w:val="20"/>
-          <w:szCs w:val="20"/>
-        </w:rPr>
-      </w:pPr>
-      <w:r>
-        <w:rPr>
-          <w:rFonts w:ascii="Montserrat" w:eastAsia="Montserrat" w:hAnsi="Montserrat" w:cs="Montserrat"/>
-          <w:color w:val="000000"/>
-          <w:sz w:val="20"/>
-          <w:szCs w:val="20"/>
-        </w:rPr>
-        <w:t>При этом уплаченная ранее сумма денежных средств ЗАКАЗЧИКОМ возврату последнему не подлежит.</w:t>
+        <w:t>— Если ЗАКАЗЧИК ведет себя грубо, неуважительно или если требования ЗАКАЗЧИКА, явно нарушают нормы действующего законодательства Российской Федерации.</w:t>
       </w:r>
     </w:p>
     <w:p>
@@ -3039,7 +3041,7 @@
           <w:sz w:val="20"/>
           <w:szCs w:val="20"/>
         </w:rPr>
-        <w:t>ЗАКАЗЧИК вправе расторгнуть Договор при условии оплаты им фактически выполненной ИСПОЛНИТЕЛЕМ работы.</w:t>
+        <w:t>Возможность расторжения договора ЗАКАЗЧИКОМ возможна при условии оплаты ИСПОЛНИТЕЛЮ стоимости фактически выполненных работ на момент расторжения. При этом стороны безоговорочно соглашаются и подтверждают, что в случае расторжения Договора по инициативе ЗАКАЗЧИКА сумма в размере не менее 5 000,00 (пяти тысяч) рублей возврату не подлежит и в полном объеме удерживается ИСПОЛНИТЕЛЕМ в качестве компенсации расходов, связанных с проведением первичного анализа ситуации, заключением договора и организацией иных подготовительных мероприятий.</w:t>
       </w:r>
     </w:p>
     <w:p>

</xml_diff>